<commit_message>
chore: prepare SmartTriageAI preview
</commit_message>
<xml_diff>
--- a/docs/apresentacao/Manual_de_Apresentacao_SmarTriageIA.docx
+++ b/docs/apresentacao/Manual_de_Apresentacao_SmarTriageIA.docx
@@ -288,7 +288,7 @@
         <w:jc w:val="center"/>
       </w:pPr>
       <w:r>
-        <w:t>Versão de referência: estado do repositório auditado em 18/10/2026.</w:t>
+        <w:t xml:space="preserve">Versão de referência: revisão do repositório em 19/10/2026. Testes locais de build, lint, tipos, unidade e integração passaram; publicação, hardware físico e E2E não foram validados.</w:t>
       </w:r>
     </w:p>
     <w:p>
@@ -333,7 +333,7 @@
         <w:fldChar w:fldCharType="begin"/>
         <w:instrText xml:space="preserve"> TOC \o "1-3" \h \z \u </w:instrText>
         <w:fldChar w:fldCharType="separate"/>
-        <w:t>(TOC will populate after updating fields)</w:t>
+        <w:t xml:space="preserve">Conteúdo: visão geral; roteiro de apresentação; demonstração; arquitetura e dados; hardware e API; classificação e Groq; segurança e limitações; perguntas; glossário e checklist.</w:t>
         <w:fldChar w:fldCharType="end"/>
       </w:r>
     </w:p>
@@ -1263,7 +1263,7 @@
         <w:pStyle w:val="ListBullet"/>
       </w:pPr>
       <w:r>
-        <w:t>“O hardware físico foi integrado ao caminho técnico de recebimento; sensores e calibração precisam de validação própria.”</w:t>
+        <w:t xml:space="preserve">“A API e o contrato de recebimento do ESP32 estão implementados; o hardware, sensores, firmware e calibração físicos ainda exigem validação própria.”</w:t>
       </w:r>
     </w:p>
     <w:p>
@@ -1295,7 +1295,7 @@
         <w:pStyle w:val="ListBullet"/>
       </w:pPr>
       <w:r>
-        <w:t>Abrir o site publicado e duas abas: paciente e enfermagem.</w:t>
+        <w:t xml:space="preserve">Abrir o ambiente local ou Preview previamente configurado e duas abas: paciente e enfermagem. Não presumir que um deploy ou suas variáveis foram verificados.</w:t>
       </w:r>
     </w:p>
     <w:p>
@@ -1303,7 +1303,7 @@
         <w:pStyle w:val="ListBullet"/>
       </w:pPr>
       <w:r>
-        <w:t>Confirmar banco e variáveis de ambiente no ambiente de deploy sem exibir valores.</w:t>
+        <w:t xml:space="preserve">Confirmar que o banco é exclusivo da demonstração e que variáveis e migrations estão configuradas no ambiente correto, sem exibir valores.</w:t>
       </w:r>
     </w:p>
     <w:p>
@@ -2653,7 +2653,7 @@
                 <w:b w:val="0"/>
                 <w:sz w:val="17"/>
               </w:rPr>
-              <w:t>docs/VERCEL_REMOTE_HARDWARE_SETUP.md</w:t>
+              <w:t xml:space="preserve">Hospedagem alvo documentada; deploy e variáveis do projeto não foram verificados</w:t>
             </w:r>
           </w:p>
         </w:tc>
@@ -2757,7 +2757,7 @@
                 <w:b w:val="0"/>
                 <w:sz w:val="17"/>
               </w:rPr>
-              <w:t>Groq / llama-3.3-70b-versatile</w:t>
+              <w:t xml:space="preserve">Groq / modelo configurável</w:t>
             </w:r>
           </w:p>
         </w:tc>
@@ -2817,7 +2817,7 @@
                 <w:b w:val="0"/>
                 <w:sz w:val="17"/>
               </w:rPr>
-              <w:t>src/server/services/ai/groq-suggestion.ts</w:t>
+              <w:t xml:space="preserve">Sugestão experimental server-side; modelo padrão openai/gpt-oss-120b</w:t>
             </w:r>
           </w:p>
         </w:tc>
@@ -5753,7 +5753,7 @@
         <w:spacing w:after="120" w:line="259" w:lineRule="auto"/>
       </w:pPr>
       <w:r>
-        <w:t>A ação profissional da enfermagem pode solicitar uma sugestão ao endpoint compatível da Groq usando o modelo llama-3.3-70b-versatile. O serviço envia um conjunto mínimo: idade, sexo, queixa, intensidade/duração, alertas afirmativos, sinais aceitos e prioridade do sistema. O prompt exige linguagem de apoio, ausência de diagnóstico e declaração de dados insuficientes. A resposta é validada por Zod e persistida como AiSuggestion.</w:t>
+        <w:t xml:space="preserve">A enfermagem pode solicitar no painel uma sugestão experimental pela API do Groq. O serviço server-side usa GROQ_API_KEY e GROQ_MODEL (padrão atual: openai/gpt-oss-120b). Envia idade, sexo, queixa, intensidade e duração, alertas afirmativos, FC e SpO₂ aceitas, temperatura/peso/altura quando disponíveis e prioridade recomendada pelo sistema. A resposta estruturada pode sugerir prioridade e nível de atenção, trazer fatores e conclusão breve; é validada por Zod e persistida como AiSuggestion. A chave nunca deve ir ao navegador, logs ou documento.</w:t>
       </w:r>
     </w:p>
     <w:tbl>
@@ -6179,7 +6179,7 @@
         <w:pStyle w:val="ListBullet"/>
       </w:pPr>
       <w:r>
-        <w:t>Cookies de paciente e enfermagem são separados, assinados, httpOnly e carregam apenas identificador opaco da triagem.</w:t>
+        <w:t xml:space="preserve">As sessões de paciente e enfermagem usam cookies separados, assinados e httpOnly. O cookie do paciente contém ID opaco da triagem; o da enfermagem contém a referência genérica do ator e tipo/expiração. O acesso profissional usa credencial compartilhada demonstrativa, não identidade institucional.</w:t>
       </w:r>
     </w:p>
     <w:p>
@@ -6243,7 +6243,7 @@
         <w:spacing w:after="120" w:line="259" w:lineRule="auto"/>
       </w:pPr>
       <w:r>
-        <w:t>Há idempotência e controle de estado para leituras/sessões em pontos relevantes, mas a confiabilidade física depende de Wi-Fi, firmware, sensores, calibração e operação. Em produção real ainda seriam necessários observabilidade, política de retry, gestão de dispositivos, testes de carga e validação de recuperação.</w:t>
+        <w:t xml:space="preserve">Há validação de entrada, controle de estado e idempotência em operações relevantes. O rate limiter distribuído depende de PostgreSQL e da migration RateLimitBucket. A confiabilidade física depende de Wi-Fi, firmware, sensores e calibração, ainda não testados. Para uso real ainda são necessários identidade institucional, operação monitorada, testes de carga e validação adequada.</w:t>
       </w:r>
     </w:p>
     <w:p>
@@ -6357,7 +6357,7 @@
                 <w:b w:val="0"/>
                 <w:sz w:val="17"/>
               </w:rPr>
-              <w:t>produto experimental; sem validação clínica/certificação; firmware completo, pinos e sensores não estão neste repositório; IA externa opcional; temperatura técnica não é convertida automaticamente em medição clínica nesta aceitação atual.</w:t>
+              <w:t xml:space="preserve">Produto demonstrativo; API/contrato HTTP do ESP32, leituras BPM/SpO₂/temperatura e sessões técnicas; aceitação explícita antes de vincular FC/SpO₂ ao domínio; sugestão Groq opcional. Sensores/modelos e firmware não são confirmados neste repositório.</w:t>
             </w:r>
           </w:p>
         </w:tc>
@@ -6379,7 +6379,7 @@
                 <w:b w:val="0"/>
                 <w:sz w:val="17"/>
               </w:rPr>
-              <w:t>Não testado neste ambiente</w:t>
+              <w:t xml:space="preserve">Estado de validação</w:t>
             </w:r>
           </w:p>
         </w:tc>
@@ -6399,7 +6399,7 @@
                 <w:b w:val="0"/>
                 <w:sz w:val="17"/>
               </w:rPr>
-              <w:t>suíte de integração PostgreSQL depende de TEST_DATABASE_URL; deploy real, limites da Groq, escala, recuperação de rede e calibração física não podem ser confirmados só pelo código local.</w:t>
+              <w:t xml:space="preserve">ESLint, TypeScript, Prisma validate, 166 testes unitários, 15 testes de integração em banco local isolado e build passaram em 19/10/2026. Sem E2E, sem teste de hardware físico e sem validação da Vercel/banco remoto.</w:t>
             </w:r>
           </w:p>
         </w:tc>
@@ -6441,7 +6441,7 @@
                 <w:b w:val="0"/>
                 <w:sz w:val="17"/>
               </w:rPr>
-              <w:t>documentar firmware versionado; contrato de erro/retry; observabilidade; testes E2E; validação de sensores; revisão de segurança; gestão de expiração/rotação de tokens.</w:t>
+              <w:t xml:space="preserve">Identidade profissional institucional e autorização por perfil; E2E; validação de sensores/firmware; auditoria online atualizada; revisar o advisory High de braces@3.0.3. A auditoria pnpm foi bloqueada por falha na verificação de assinatura, sem bypass.</w:t>
             </w:r>
           </w:p>
         </w:tc>
@@ -6483,7 +6483,7 @@
                 <w:b w:val="0"/>
                 <w:sz w:val="17"/>
               </w:rPr>
-              <w:t>validação clínica formal; integração com identidade institucional; mais sensores; protocolo de atendimento; escalabilidade; modelo local ou provedor alternativo; interoperabilidade.</w:t>
+              <w:t xml:space="preserve">Validação clínica formal; integração institucional; governança, segurança e operação monitorada; interoperabilidade e outros sensores somente após decisão e validação próprias.</w:t>
             </w:r>
           </w:p>
         </w:tc>
@@ -8591,7 +8591,7 @@
         <w:spacing w:after="120" w:line="259" w:lineRule="auto"/>
       </w:pPr>
       <w:r>
-        <w:t>Validações locais registradas no estado auditado: Prisma validate, Prisma generate, testes unitários Vitest (110 testes), ESLint, TypeScript e build passaram. A suíte de integração depende de TEST_DATABASE_URL e não foi considerada executada sem esse banco de teste configurado. O deploy remoto e a calibração física devem ser verificados no ambiente real.</w:t>
+        <w:t xml:space="preserve">Validação local em 19/10/2026: ESLint, TypeScript, Prisma validate, 166 testes unitários e 15 testes de integração em banco local isolado passaram; o build Next.js de produção também passou. Não há E2E executado. Vercel, variáveis e banco remotos, Groq em produção, firmware e sensores físicos não foram validados. A instalação/auditoria online do pnpm permaneceu pendente por falha de verificação de assinatura; o lockfile inclui braces@3.0.3 com advisory High sem versão corrigida.</w:t>
       </w:r>
     </w:p>
     <w:sectPr>

</xml_diff>